<commit_message>
deal screen: update higharc.docx
</commit_message>
<xml_diff>
--- a/hub/static/research/companies/higharc.docx
+++ b/hub/static/research/companies/higharc.docx
@@ -77,7 +77,7 @@
           <w:color w:val="1A1A1A"/>
           <w:sz w:val="32"/>
         </w:rPr>
-        <w:t>2.8 / 4.0</w:t>
+        <w:t>2.9 / 4.0</w:t>
       </w:r>
       <w:r>
         <w:rPr>
@@ -87,7 +87,17 @@
           <w:color w:val="828282"/>
           <w:sz w:val="21"/>
         </w:rPr>
-        <w:t xml:space="preserve">   —   BORDERLINE — REVIEW</w:t>
+        <w:t xml:space="preserve">   (raw 2.8)</w:t>
+      </w:r>
+      <w:r>
+        <w:rPr>
+          <w:rFonts w:ascii="Sora" w:hAnsi="Sora"/>
+          <w:b w:val="0"/>
+          <w:caps w:val="0"/>
+          <w:color w:val="828282"/>
+          <w:sz w:val="21"/>
+        </w:rPr>
+        <w:t xml:space="preserve">   —   MORE DILIGENCE</w:t>
       </w:r>
     </w:p>
     <w:tbl>
@@ -272,7 +282,7 @@
                 <w:color w:val="3C3C3C"/>
                 <w:sz w:val="18"/>
               </w:rPr>
-              <w:t>Higharc is raising a $95M Series C round led by Insight Partners, a Tier 1 global software investor, with participation from Wellington Management and a strong syndicate including Fifth Wall, Spark Capital, Lux Capital, SE Ventures and others.[4][5][3][2] Insight Partners has been an existing investor since earlier rounds, so this is a top‑tier inside round rather than new‑money Tier 1, aligning with the 2–3 band; given round size, stage (Series C) and quality of syndicate, this fits better at 3 than 2.[5][3]</w:t>
+              <w:t>Higharc announced a $95M Series C round led by Insight Partners, a Tier 1 firm on the rubric’s list, with participation from Wellington Management, Fifth Wall, Spark Capital, Lux Capital, SE Ventures and others.[4][5][8] This is a Series C (B+), clearly new-money institutional lead; geography (Durham, NC) is within mandate.[4][6] Tier 1 lead at Series C fits the Score 3 anchor (Tier 1, not Tier 1+), and there is no indication that Insight is domain-strategic in homebuilding (financial investor, not an operator).</w:t>
             </w:r>
           </w:p>
         </w:tc>
@@ -304,7 +314,7 @@
                 <w:color w:val="1A1A1A"/>
                 <w:sz w:val="19"/>
               </w:rPr>
-              <w:t>AI Score</w:t>
+              <w:t>Founder / Team Quality</w:t>
             </w:r>
           </w:p>
         </w:tc>
@@ -334,7 +344,7 @@
                 <w:color w:val="1A1A1A"/>
                 <w:sz w:val="19"/>
               </w:rPr>
-              <w:t>4</w:t>
+              <w:t>3</w:t>
             </w:r>
             <w:r>
               <w:rPr>
@@ -374,7 +384,7 @@
                 <w:color w:val="3C3C3C"/>
                 <w:sz w:val="18"/>
               </w:rPr>
-              <w:t>Higharc describes itself as a “homebuilding AI company for the full design-to-construction lifecycle,” positioning AI as the core of its product rather than a peripheral feature.[4][5] The Series C is explicitly framed as funding to scale AI for homebuilding, and products like AutoTranslate AI that ingest 2D floor plans to generate 3D spatial models and material takeoffs further support that AI is the central value proposition, consistent with a pure‑play AI score.[3]</w:t>
+              <w:t>Higharc was founded by CEO Marc Breiner and a team including technologists from Google and Autodesk and experienced homebuilding operators (reported in prior coverage; current Series C materials emphasize combining software veterans with industry experts).[5][8] The company has scaled to partner with major industry players like US LBM and large production builders, implying credible execution and recruiting capability, but there is no public evidence of prior $100M+ ARR exits by the founders, so this fits the ‘first-time founder with elite/strong tech + domain complement’ Score 3 anchor rather than a proven-serial-exit Score 4.[5][3]</w:t>
             </w:r>
           </w:p>
         </w:tc>
@@ -476,7 +486,7 @@
                 <w:color w:val="3C3C3C"/>
                 <w:sz w:val="18"/>
               </w:rPr>
-              <w:t>The Series C announcement states total funding now exceeds $170M, but provides no concrete revenue, growth, NDR, LTV/CAC or burn metrics.[4][5] External coverage emphasizes strong demand and expansion plans, but still lacks quantified fundamentals; given the sizable Series C led by a Tier 1 investor and clear value proposition in a large market, fundamentals are likely above the Score 1 floor yet cannot be substantiated to meet the Score 3 bar, so a conservative mid‑band score is appropriate.[3][8]</w:t>
+              <w:t>The Series C is $95M, bringing total funding to more than $170M, signaling meaningful traction and investor confidence.[4][6][1] Public sources describe Higharc as working with mid-market and large production homebuilders that collectively build 800,000+ homes annually, and expanding into the materials supply chain via US LBM, suggesting growing commercial adoption and a real moat around spatial data and workflows.[1][3][5] However, no hard metrics for ARR, growth rate, NDR, LTV/CAC, or burn are disclosed in press or investor coverage — all key financials are [NOT PUBLIC] — so per rubric these fundamentals must cap at 2, with the score reflecting a data gap rather than confirmed weak numbers.[1][4][6]</w:t>
             </w:r>
           </w:p>
         </w:tc>
@@ -578,7 +588,7 @@
                 <w:color w:val="3C3C3C"/>
                 <w:sz w:val="18"/>
               </w:rPr>
-              <w:t>Higharc targets the large U.S. homebuilding and construction planning market with an AI platform that can automate design, generate precise material takeoffs, and improve project economics, which suggests meaningful upside if widely adopted.[3][5][8] A $95M Series C at this stage likely implies moderate entry valuation and some execution and adoption risk, but with a Tier 1 lead and differentiated AI product, &gt;3x potential with some risk of capital loss is a reasonable fit, while &gt;7x with little risk cannot be justified from available data.[4][3]</w:t>
+              <w:t>Higharc targets production homebuilders and now building-materials suppliers, addressing a very large TAM (U.S. production builders construct 800k+ homes annually, with significant software and materials spend tied to design, estimating, and construction workflows).[1][3][5] The product replaces multiple legacy tools (CAD, plan management, buyer config, estimating, construction docs) with an integrated AI-native platform, suggesting potential for deep wallet share and high switching costs.[1][5] At a $95M Series C with $170M+ raised, valuation will be later-stage but not obviously out of line for a vertical AI infrastructure/platform play; this supports a reasonable path to venture-scale outcomes (3–6x MOIC / 20–30% IRR) if it continues to scale across builders and the supply chain, but without revenue multiples or entry valuation disclosed we cannot underwrite a 6x base case, so this fits the Score 3 anchor rather than 4.[1][3][5]</w:t>
             </w:r>
           </w:p>
         </w:tc>
@@ -610,6 +620,128 @@
                 <w:color w:val="1A1A1A"/>
                 <w:sz w:val="19"/>
               </w:rPr>
+              <w:t>AI Score</w:t>
+            </w:r>
+          </w:p>
+        </w:tc>
+        <w:tc>
+          <w:tcPr>
+            <w:tcW w:type="dxa" w:w="792"/>
+            <w:shd w:val="clear" w:color="auto" w:fill="F5F5F5"/>
+            <w:tcMar>
+              <w:top w:w="40" w:type="dxa"/>
+              <w:bottom w:w="40" w:type="dxa"/>
+              <w:left w:w="60" w:type="dxa"/>
+              <w:right w:w="60" w:type="dxa"/>
+            </w:tcMar>
+            <w:tcBorders>
+              <w:top w:val="nil"/>
+              <w:left w:val="nil"/>
+              <w:right w:val="nil"/>
+              <w:bottom w:val="single" w:sz="4" w:color="E4DFD5"/>
+            </w:tcBorders>
+          </w:tcPr>
+          <w:p>
+            <w:r>
+              <w:rPr>
+                <w:rFonts w:ascii="Sora" w:hAnsi="Sora"/>
+                <w:b/>
+                <w:caps w:val="0"/>
+                <w:color w:val="1A1A1A"/>
+                <w:sz w:val="19"/>
+              </w:rPr>
+              <w:t>4</w:t>
+            </w:r>
+            <w:r>
+              <w:rPr>
+                <w:rFonts w:ascii="Sora" w:hAnsi="Sora"/>
+                <w:b w:val="0"/>
+                <w:caps w:val="0"/>
+                <w:color w:val="828282"/>
+                <w:sz w:val="17"/>
+              </w:rPr>
+              <w:t xml:space="preserve"> / 4</w:t>
+            </w:r>
+          </w:p>
+        </w:tc>
+        <w:tc>
+          <w:tcPr>
+            <w:tcW w:type="dxa" w:w="5904"/>
+            <w:shd w:val="clear" w:color="auto" w:fill="F5F5F5"/>
+            <w:tcMar>
+              <w:top w:w="40" w:type="dxa"/>
+              <w:bottom w:w="40" w:type="dxa"/>
+              <w:left w:w="60" w:type="dxa"/>
+              <w:right w:w="60" w:type="dxa"/>
+            </w:tcMar>
+            <w:tcBorders>
+              <w:top w:val="nil"/>
+              <w:left w:val="nil"/>
+              <w:right w:val="nil"/>
+              <w:bottom w:val="single" w:sz="4" w:color="E4DFD5"/>
+            </w:tcBorders>
+          </w:tcPr>
+          <w:p>
+            <w:r>
+              <w:rPr>
+                <w:rFonts w:ascii="Sora" w:hAnsi="Sora"/>
+                <w:b w:val="0"/>
+                <w:caps w:val="0"/>
+                <w:color w:val="3C3C3C"/>
+                <w:sz w:val="18"/>
+              </w:rPr>
+              <w:t xml:space="preserve">Higharc describes itself as “the homebuilding AI company for the full design-to-construction lifecycle” and positions its core technology as </w:t>
+            </w:r>
+            <w:r>
+              <w:rPr>
+                <w:rFonts w:ascii="Sora" w:hAnsi="Sora"/>
+                <w:b/>
+                <w:caps w:val="0"/>
+                <w:color w:val="3C3C3C"/>
+                <w:sz w:val="18"/>
+              </w:rPr>
+              <w:t>spatial AI</w:t>
+            </w:r>
+            <w:r>
+              <w:rPr>
+                <w:rFonts w:ascii="Sora" w:hAnsi="Sora"/>
+                <w:b w:val="0"/>
+                <w:caps w:val="0"/>
+                <w:color w:val="3C3C3C"/>
+                <w:sz w:val="18"/>
+              </w:rPr>
+              <w:t xml:space="preserve"> models trained to understand physical spaces, automating complex workflows across building design, 3D modeling, estimating, sales and construction documentation.[4][5] The AutoTranslate AI ingests 2D floor plans, converts them into 3D spatial models, and generates precise material takeoffs aligned with US LBM’s catalog, which indicates a proprietary data flywheel (plans, materials, builder configurations) and domain-specific models not trivially replicated by generic LLM updates.[3][5] The platform’s moat is explicitly the spatial AI architecture and structured 3D data, powering end-to-end workflows for a regulated, complex industry (homebuilding), so this fits the pure-play AI / defensible architecture Score 4 anchor rather than a mere feature-layer use of AI.[1][4][5]</w:t>
+            </w:r>
+          </w:p>
+        </w:tc>
+      </w:tr>
+      <w:tr>
+        <w:tc>
+          <w:tcPr>
+            <w:tcW w:type="dxa" w:w="2664"/>
+            <w:shd w:val="clear" w:color="auto" w:fill="FFFFFF"/>
+            <w:tcMar>
+              <w:top w:w="40" w:type="dxa"/>
+              <w:bottom w:w="40" w:type="dxa"/>
+              <w:left w:w="60" w:type="dxa"/>
+              <w:right w:w="60" w:type="dxa"/>
+            </w:tcMar>
+            <w:tcBorders>
+              <w:top w:val="nil"/>
+              <w:left w:val="nil"/>
+              <w:right w:val="nil"/>
+              <w:bottom w:val="single" w:sz="4" w:color="E4DFD5"/>
+            </w:tcBorders>
+          </w:tcPr>
+          <w:p>
+            <w:r>
+              <w:rPr>
+                <w:rFonts w:ascii="Sora" w:hAnsi="Sora"/>
+                <w:b w:val="0"/>
+                <w:caps w:val="0"/>
+                <w:color w:val="1A1A1A"/>
+                <w:sz w:val="19"/>
+              </w:rPr>
               <w:t>Terms</w:t>
             </w:r>
           </w:p>
@@ -617,7 +749,7 @@
         <w:tc>
           <w:tcPr>
             <w:tcW w:type="dxa" w:w="792"/>
-            <w:shd w:val="clear" w:color="auto" w:fill="F5F5F5"/>
+            <w:shd w:val="clear" w:color="auto" w:fill="FFFFFF"/>
             <w:tcMar>
               <w:top w:w="40" w:type="dxa"/>
               <w:bottom w:w="40" w:type="dxa"/>
@@ -657,7 +789,7 @@
         <w:tc>
           <w:tcPr>
             <w:tcW w:type="dxa" w:w="5904"/>
-            <w:shd w:val="clear" w:color="auto" w:fill="F5F5F5"/>
+            <w:shd w:val="clear" w:color="auto" w:fill="FFFFFF"/>
             <w:tcMar>
               <w:top w:w="40" w:type="dxa"/>
               <w:bottom w:w="40" w:type="dxa"/>
@@ -680,7 +812,7 @@
                 <w:color w:val="3C3C3C"/>
                 <w:sz w:val="18"/>
               </w:rPr>
-              <w:t>Public sources on the Series C disclose round size, lead, and participants but provide no information on valuation, liquidation preferences, structure, fees, or carry relevant to an SPV’s economics.[4][5][3] In the absence of explicit terms data, and given this is a standard institutional Series C led by Insight Partners, a cautious assumption near typical 0/10 SPV economics but without enough detail to justify a higher score is appropriate, so this dimension is scored low‑mid rather than guessing favorable terms.[4][5]</w:t>
+              <w:t>Public coverage and the company’s own press release describe the round but do not disclose SPV structures, carry, upfront fees, or information rights for potential co-investors — these terms are [NOT PUBLIC].[4][6][5] Given it is a standard venture-led primary Series C with Insight Partners and other institutional investors, it is reasonable to assume terms fall within typical late-stage VC norms (no recurring management fee at the company level, standard preferred equity), but without specific co-invest/SPV economics we must avoid assuming 0/0/10 and land on the data-gap anchor; per rubric, missing deal-structure details maps more conservatively to Score 2 rather than 3.[4][5]</w:t>
             </w:r>
           </w:p>
         </w:tc>
@@ -722,7 +854,7 @@
           <w:color w:val="1A1A1A"/>
           <w:sz w:val="21"/>
         </w:rPr>
-        <w:t>Higharc is a Durham, NC–based homebuilding AI company raising a $95M Series C led by Tier 1 investor Insight Partners, with a strong multi‑investor syndicate, clearly passing the stage (Series C) and developed‑market geography gates.[4][5][2] The deal partially aligns with ID8’s core thesis: it is a Tier 1–led Series C, but Insight Partners is an existing investor and thus this is a top‑tier inside round rather than new‑money Tier 1 joining the cap table for the first time, which weakens thesis fit.[5] Overall, Higharc appears to be a pure‑play AI platform with significant market opportunity and strong round dynamics, but lack of disclosed performance metrics and deal terms limits certainty on fundamentals and ultimate return profile.</w:t>
+        <w:t>Higharc is a Durham, NC-based homebuilding AI platform that has just raised a $95M Series C led by Insight Partners, a Tier 1 VC, with broad participation from sector-savvy funds, squarely within ID8’s geography and stage mandate.[4][5][6] The deal broadly aligns with ID8’s thesis: it is a B+ round with a new-money Tier 1 lead, structural AI at the core of the moat (spatial AI and AutoTranslate driving design-to-construction workflows), and a large, under-digitized market in production homebuilding and materials supply.[1][3][4][5] The main caveat is fundamentals and terms: key financial metrics and co-invest economics are not publicly disclosed, so the fit verdict rests on strong qualitative and investor signals rather than hard numbers, suggesting further deep-dive diligence before commitment.</w:t>
       </w:r>
     </w:p>
     <w:p>

</xml_diff>

<commit_message>
Restore Higharc's real Stage 1 score, add script to purge other failed screens
Higharc's 2026-07-06 real score (2.9/4.0, more diligence) was silently
overwritten on 2026-07-09 by a Perplexity 401 failure -- both write paths
(hub_push git commit, firestore_push) always write back regardless of
whether Stage 1 actually succeeded. Restored the old hub's md/docx from the
last good commits (c5e6cf9 / 159b473).

scripts/purge_failed_screens.py finds and (with --apply) deletes any
"scoring failed" screen doc in production Firestore, letting a real prior
dated screen resurface as latest via hub-next's existing max-date query --
same mechanism, applied at scale for every affected company, not just Higharc.
</commit_message>
<xml_diff>
--- a/hub/static/research/companies/higharc.docx
+++ b/hub/static/research/companies/higharc.docx
@@ -44,7 +44,7 @@
           <w:color w:val="828282"/>
           <w:sz w:val="18"/>
         </w:rPr>
-        <w:t>Screened 2026-07-09</w:t>
+        <w:t>Screened 2026-07-06</w:t>
       </w:r>
     </w:p>
     <w:p>
@@ -77,7 +77,7 @@
           <w:color w:val="1A1A1A"/>
           <w:sz w:val="32"/>
         </w:rPr>
-        <w:t>0.0 / 4.0</w:t>
+        <w:t>2.9 / 4.0</w:t>
       </w:r>
       <w:r>
         <w:rPr>
@@ -87,7 +87,7 @@
           <w:color w:val="828282"/>
           <w:sz w:val="21"/>
         </w:rPr>
-        <w:t xml:space="preserve">   (raw 0.0)</w:t>
+        <w:t xml:space="preserve">   (raw 2.8)</w:t>
       </w:r>
       <w:r>
         <w:rPr>
@@ -97,7 +97,7 @@
           <w:color w:val="828282"/>
           <w:sz w:val="21"/>
         </w:rPr>
-        <w:t xml:space="preserve">   —   SCORING FAILED — NOT SCREENED</w:t>
+        <w:t xml:space="preserve">   —   MORE DILIGENCE</w:t>
       </w:r>
     </w:p>
     <w:tbl>
@@ -185,6 +185,618 @@
           </w:p>
         </w:tc>
       </w:tr>
+      <w:tr>
+        <w:tc>
+          <w:tcPr>
+            <w:tcW w:type="dxa" w:w="2664"/>
+            <w:shd w:val="clear" w:color="auto" w:fill="F5F5F5"/>
+            <w:tcMar>
+              <w:top w:w="40" w:type="dxa"/>
+              <w:bottom w:w="40" w:type="dxa"/>
+              <w:left w:w="60" w:type="dxa"/>
+              <w:right w:w="60" w:type="dxa"/>
+            </w:tcMar>
+            <w:tcBorders>
+              <w:top w:val="nil"/>
+              <w:left w:val="nil"/>
+              <w:right w:val="nil"/>
+              <w:bottom w:val="single" w:sz="4" w:color="E4DFD5"/>
+            </w:tcBorders>
+          </w:tcPr>
+          <w:p>
+            <w:r>
+              <w:rPr>
+                <w:rFonts w:ascii="Sora" w:hAnsi="Sora"/>
+                <w:b w:val="0"/>
+                <w:caps w:val="0"/>
+                <w:color w:val="1A1A1A"/>
+                <w:sz w:val="19"/>
+              </w:rPr>
+              <w:t>Lead / Round Dynamics</w:t>
+            </w:r>
+          </w:p>
+        </w:tc>
+        <w:tc>
+          <w:tcPr>
+            <w:tcW w:type="dxa" w:w="792"/>
+            <w:shd w:val="clear" w:color="auto" w:fill="F5F5F5"/>
+            <w:tcMar>
+              <w:top w:w="40" w:type="dxa"/>
+              <w:bottom w:w="40" w:type="dxa"/>
+              <w:left w:w="60" w:type="dxa"/>
+              <w:right w:w="60" w:type="dxa"/>
+            </w:tcMar>
+            <w:tcBorders>
+              <w:top w:val="nil"/>
+              <w:left w:val="nil"/>
+              <w:right w:val="nil"/>
+              <w:bottom w:val="single" w:sz="4" w:color="E4DFD5"/>
+            </w:tcBorders>
+          </w:tcPr>
+          <w:p>
+            <w:r>
+              <w:rPr>
+                <w:rFonts w:ascii="Sora" w:hAnsi="Sora"/>
+                <w:b/>
+                <w:caps w:val="0"/>
+                <w:color w:val="1A1A1A"/>
+                <w:sz w:val="19"/>
+              </w:rPr>
+              <w:t>3</w:t>
+            </w:r>
+            <w:r>
+              <w:rPr>
+                <w:rFonts w:ascii="Sora" w:hAnsi="Sora"/>
+                <w:b w:val="0"/>
+                <w:caps w:val="0"/>
+                <w:color w:val="828282"/>
+                <w:sz w:val="17"/>
+              </w:rPr>
+              <w:t xml:space="preserve"> / 4</w:t>
+            </w:r>
+          </w:p>
+        </w:tc>
+        <w:tc>
+          <w:tcPr>
+            <w:tcW w:type="dxa" w:w="5904"/>
+            <w:shd w:val="clear" w:color="auto" w:fill="F5F5F5"/>
+            <w:tcMar>
+              <w:top w:w="40" w:type="dxa"/>
+              <w:bottom w:w="40" w:type="dxa"/>
+              <w:left w:w="60" w:type="dxa"/>
+              <w:right w:w="60" w:type="dxa"/>
+            </w:tcMar>
+            <w:tcBorders>
+              <w:top w:val="nil"/>
+              <w:left w:val="nil"/>
+              <w:right w:val="nil"/>
+              <w:bottom w:val="single" w:sz="4" w:color="E4DFD5"/>
+            </w:tcBorders>
+          </w:tcPr>
+          <w:p>
+            <w:r>
+              <w:rPr>
+                <w:rFonts w:ascii="Sora" w:hAnsi="Sora"/>
+                <w:b w:val="0"/>
+                <w:caps w:val="0"/>
+                <w:color w:val="3C3C3C"/>
+                <w:sz w:val="18"/>
+              </w:rPr>
+              <w:t>Higharc announced a $95M Series C led by Insight Partners, a Tier 1 fund on the rubric’s list, with participation from Wellington Management, Fifth Wall, Spark Capital, Lux Capital, SE Ventures and others.[4][5][8] Insight appears to be a NEW lead at Series C (earlier rounds were led by other firms per historical coverage), aligning with the Tier 1 new-money Series B+ thesis, but co-invest access for ID8 is not yet confirmed — hence 3, not 4.</w:t>
+            </w:r>
+          </w:p>
+        </w:tc>
+      </w:tr>
+      <w:tr>
+        <w:tc>
+          <w:tcPr>
+            <w:tcW w:type="dxa" w:w="2664"/>
+            <w:shd w:val="clear" w:color="auto" w:fill="FFFFFF"/>
+            <w:tcMar>
+              <w:top w:w="40" w:type="dxa"/>
+              <w:bottom w:w="40" w:type="dxa"/>
+              <w:left w:w="60" w:type="dxa"/>
+              <w:right w:w="60" w:type="dxa"/>
+            </w:tcMar>
+            <w:tcBorders>
+              <w:top w:val="nil"/>
+              <w:left w:val="nil"/>
+              <w:right w:val="nil"/>
+              <w:bottom w:val="single" w:sz="4" w:color="E4DFD5"/>
+            </w:tcBorders>
+          </w:tcPr>
+          <w:p>
+            <w:r>
+              <w:rPr>
+                <w:rFonts w:ascii="Sora" w:hAnsi="Sora"/>
+                <w:b w:val="0"/>
+                <w:caps w:val="0"/>
+                <w:color w:val="1A1A1A"/>
+                <w:sz w:val="19"/>
+              </w:rPr>
+              <w:t>Founder / Team Quality</w:t>
+            </w:r>
+          </w:p>
+        </w:tc>
+        <w:tc>
+          <w:tcPr>
+            <w:tcW w:type="dxa" w:w="792"/>
+            <w:shd w:val="clear" w:color="auto" w:fill="FFFFFF"/>
+            <w:tcMar>
+              <w:top w:w="40" w:type="dxa"/>
+              <w:bottom w:w="40" w:type="dxa"/>
+              <w:left w:w="60" w:type="dxa"/>
+              <w:right w:w="60" w:type="dxa"/>
+            </w:tcMar>
+            <w:tcBorders>
+              <w:top w:val="nil"/>
+              <w:left w:val="nil"/>
+              <w:right w:val="nil"/>
+              <w:bottom w:val="single" w:sz="4" w:color="E4DFD5"/>
+            </w:tcBorders>
+          </w:tcPr>
+          <w:p>
+            <w:r>
+              <w:rPr>
+                <w:rFonts w:ascii="Sora" w:hAnsi="Sora"/>
+                <w:b/>
+                <w:caps w:val="0"/>
+                <w:color w:val="1A1A1A"/>
+                <w:sz w:val="19"/>
+              </w:rPr>
+              <w:t>3</w:t>
+            </w:r>
+            <w:r>
+              <w:rPr>
+                <w:rFonts w:ascii="Sora" w:hAnsi="Sora"/>
+                <w:b w:val="0"/>
+                <w:caps w:val="0"/>
+                <w:color w:val="828282"/>
+                <w:sz w:val="17"/>
+              </w:rPr>
+              <w:t xml:space="preserve"> / 4</w:t>
+            </w:r>
+          </w:p>
+        </w:tc>
+        <w:tc>
+          <w:tcPr>
+            <w:tcW w:type="dxa" w:w="5904"/>
+            <w:shd w:val="clear" w:color="auto" w:fill="FFFFFF"/>
+            <w:tcMar>
+              <w:top w:w="40" w:type="dxa"/>
+              <w:bottom w:w="40" w:type="dxa"/>
+              <w:left w:w="60" w:type="dxa"/>
+              <w:right w:w="60" w:type="dxa"/>
+            </w:tcMar>
+            <w:tcBorders>
+              <w:top w:val="nil"/>
+              <w:left w:val="nil"/>
+              <w:right w:val="nil"/>
+              <w:bottom w:val="single" w:sz="4" w:color="E4DFD5"/>
+            </w:tcBorders>
+          </w:tcPr>
+          <w:p>
+            <w:r>
+              <w:rPr>
+                <w:rFonts w:ascii="Sora" w:hAnsi="Sora"/>
+                <w:b w:val="0"/>
+                <w:caps w:val="0"/>
+                <w:color w:val="3C3C3C"/>
+                <w:sz w:val="18"/>
+              </w:rPr>
+              <w:t>Higharc’s founders include CEO Marc Breiner and co-founders from architecture, construction-tech and software backgrounds; Breiner previously worked in product/strategy roles in software and has been a visible voice on digitizing homebuilding workflows in industry press and conferences.[4][5][8] The team has attracted a strong investor base (Insight, Spark, Lux, Fifth Wall, SE Ventures, Simpson Strong-Tie, Suffolk Technologies, MetaProp), suggesting credible recruiting and operator/advisor quality, but there is no evidence of prior $100M+ ARR scale or major exits — so this fits the ‘first-time founder with strong pedigree/domain’ anchor rather than a 4.</w:t>
+            </w:r>
+          </w:p>
+        </w:tc>
+      </w:tr>
+      <w:tr>
+        <w:tc>
+          <w:tcPr>
+            <w:tcW w:type="dxa" w:w="2664"/>
+            <w:shd w:val="clear" w:color="auto" w:fill="F5F5F5"/>
+            <w:tcMar>
+              <w:top w:w="40" w:type="dxa"/>
+              <w:bottom w:w="40" w:type="dxa"/>
+              <w:left w:w="60" w:type="dxa"/>
+              <w:right w:w="60" w:type="dxa"/>
+            </w:tcMar>
+            <w:tcBorders>
+              <w:top w:val="nil"/>
+              <w:left w:val="nil"/>
+              <w:right w:val="nil"/>
+              <w:bottom w:val="single" w:sz="4" w:color="E4DFD5"/>
+            </w:tcBorders>
+          </w:tcPr>
+          <w:p>
+            <w:r>
+              <w:rPr>
+                <w:rFonts w:ascii="Sora" w:hAnsi="Sora"/>
+                <w:b w:val="0"/>
+                <w:caps w:val="0"/>
+                <w:color w:val="1A1A1A"/>
+                <w:sz w:val="19"/>
+              </w:rPr>
+              <w:t>Fundamentals</w:t>
+            </w:r>
+          </w:p>
+        </w:tc>
+        <w:tc>
+          <w:tcPr>
+            <w:tcW w:type="dxa" w:w="792"/>
+            <w:shd w:val="clear" w:color="auto" w:fill="F5F5F5"/>
+            <w:tcMar>
+              <w:top w:w="40" w:type="dxa"/>
+              <w:bottom w:w="40" w:type="dxa"/>
+              <w:left w:w="60" w:type="dxa"/>
+              <w:right w:w="60" w:type="dxa"/>
+            </w:tcMar>
+            <w:tcBorders>
+              <w:top w:val="nil"/>
+              <w:left w:val="nil"/>
+              <w:right w:val="nil"/>
+              <w:bottom w:val="single" w:sz="4" w:color="E4DFD5"/>
+            </w:tcBorders>
+          </w:tcPr>
+          <w:p>
+            <w:r>
+              <w:rPr>
+                <w:rFonts w:ascii="Sora" w:hAnsi="Sora"/>
+                <w:b/>
+                <w:caps w:val="0"/>
+                <w:color w:val="1A1A1A"/>
+                <w:sz w:val="19"/>
+              </w:rPr>
+              <w:t>2</w:t>
+            </w:r>
+            <w:r>
+              <w:rPr>
+                <w:rFonts w:ascii="Sora" w:hAnsi="Sora"/>
+                <w:b w:val="0"/>
+                <w:caps w:val="0"/>
+                <w:color w:val="828282"/>
+                <w:sz w:val="17"/>
+              </w:rPr>
+              <w:t xml:space="preserve"> / 4</w:t>
+            </w:r>
+          </w:p>
+        </w:tc>
+        <w:tc>
+          <w:tcPr>
+            <w:tcW w:type="dxa" w:w="5904"/>
+            <w:shd w:val="clear" w:color="auto" w:fill="F5F5F5"/>
+            <w:tcMar>
+              <w:top w:w="40" w:type="dxa"/>
+              <w:bottom w:w="40" w:type="dxa"/>
+              <w:left w:w="60" w:type="dxa"/>
+              <w:right w:w="60" w:type="dxa"/>
+            </w:tcMar>
+            <w:tcBorders>
+              <w:top w:val="nil"/>
+              <w:left w:val="nil"/>
+              <w:right w:val="nil"/>
+              <w:bottom w:val="single" w:sz="4" w:color="E4DFD5"/>
+            </w:tcBorders>
+          </w:tcPr>
+          <w:p>
+            <w:r>
+              <w:rPr>
+                <w:rFonts w:ascii="Sora" w:hAnsi="Sora"/>
+                <w:b w:val="0"/>
+                <w:caps w:val="0"/>
+                <w:color w:val="3C3C3C"/>
+                <w:sz w:val="18"/>
+              </w:rPr>
+              <w:t>The Series C size ($95M) and total funding ($170M+) imply meaningful traction with mid-market and large production homebuilders: Higharc’s AI-native platform replaces legacy CAD, plan management, buyer configuration and estimation tools for builders that construct 800,000+ homes annually in the US, indicating real deployment and a defensible workflow moat in a large market.[1][4][5][8] However, key metrics such as ARR, YoY growth, NDR, LTV/CAC and burn are [NOT PUBLIC]; without disclosed revenue or margin data, Fundamentals are capped at 2 per the rubric’s missing-data rule.</w:t>
+            </w:r>
+          </w:p>
+        </w:tc>
+      </w:tr>
+      <w:tr>
+        <w:tc>
+          <w:tcPr>
+            <w:tcW w:type="dxa" w:w="2664"/>
+            <w:shd w:val="clear" w:color="auto" w:fill="FFFFFF"/>
+            <w:tcMar>
+              <w:top w:w="40" w:type="dxa"/>
+              <w:bottom w:w="40" w:type="dxa"/>
+              <w:left w:w="60" w:type="dxa"/>
+              <w:right w:w="60" w:type="dxa"/>
+            </w:tcMar>
+            <w:tcBorders>
+              <w:top w:val="nil"/>
+              <w:left w:val="nil"/>
+              <w:right w:val="nil"/>
+              <w:bottom w:val="single" w:sz="4" w:color="E4DFD5"/>
+            </w:tcBorders>
+          </w:tcPr>
+          <w:p>
+            <w:r>
+              <w:rPr>
+                <w:rFonts w:ascii="Sora" w:hAnsi="Sora"/>
+                <w:b w:val="0"/>
+                <w:caps w:val="0"/>
+                <w:color w:val="1A1A1A"/>
+                <w:sz w:val="19"/>
+              </w:rPr>
+              <w:t>Return Potential</w:t>
+            </w:r>
+          </w:p>
+        </w:tc>
+        <w:tc>
+          <w:tcPr>
+            <w:tcW w:type="dxa" w:w="792"/>
+            <w:shd w:val="clear" w:color="auto" w:fill="FFFFFF"/>
+            <w:tcMar>
+              <w:top w:w="40" w:type="dxa"/>
+              <w:bottom w:w="40" w:type="dxa"/>
+              <w:left w:w="60" w:type="dxa"/>
+              <w:right w:w="60" w:type="dxa"/>
+            </w:tcMar>
+            <w:tcBorders>
+              <w:top w:val="nil"/>
+              <w:left w:val="nil"/>
+              <w:right w:val="nil"/>
+              <w:bottom w:val="single" w:sz="4" w:color="E4DFD5"/>
+            </w:tcBorders>
+          </w:tcPr>
+          <w:p>
+            <w:r>
+              <w:rPr>
+                <w:rFonts w:ascii="Sora" w:hAnsi="Sora"/>
+                <w:b/>
+                <w:caps w:val="0"/>
+                <w:color w:val="1A1A1A"/>
+                <w:sz w:val="19"/>
+              </w:rPr>
+              <w:t>3</w:t>
+            </w:r>
+            <w:r>
+              <w:rPr>
+                <w:rFonts w:ascii="Sora" w:hAnsi="Sora"/>
+                <w:b w:val="0"/>
+                <w:caps w:val="0"/>
+                <w:color w:val="828282"/>
+                <w:sz w:val="17"/>
+              </w:rPr>
+              <w:t xml:space="preserve"> / 4</w:t>
+            </w:r>
+          </w:p>
+        </w:tc>
+        <w:tc>
+          <w:tcPr>
+            <w:tcW w:type="dxa" w:w="5904"/>
+            <w:shd w:val="clear" w:color="auto" w:fill="FFFFFF"/>
+            <w:tcMar>
+              <w:top w:w="40" w:type="dxa"/>
+              <w:bottom w:w="40" w:type="dxa"/>
+              <w:left w:w="60" w:type="dxa"/>
+              <w:right w:w="60" w:type="dxa"/>
+            </w:tcMar>
+            <w:tcBorders>
+              <w:top w:val="nil"/>
+              <w:left w:val="nil"/>
+              <w:right w:val="nil"/>
+              <w:bottom w:val="single" w:sz="4" w:color="E4DFD5"/>
+            </w:tcBorders>
+          </w:tcPr>
+          <w:p>
+            <w:r>
+              <w:rPr>
+                <w:rFonts w:ascii="Sora" w:hAnsi="Sora"/>
+                <w:b w:val="0"/>
+                <w:caps w:val="0"/>
+                <w:color w:val="3C3C3C"/>
+                <w:sz w:val="18"/>
+              </w:rPr>
+              <w:t>Higharc targets the production homebuilding segment (mid-market and large builders doing 800k+ homes per year in the US) with an AI platform that spans design, estimating, sales and construction documentation, and is now expanding into the materials supply chain via partnerships like US LBM for AI-based estimating and material takeoff.[1][3][5][8] Given the large TAM, workflow replacement of multiple legacy tools, and extension into supplier workflows, a 3–6x MOIC with 20–30% IRR appears a reasonable base-case for a disciplined entry at Series C; upside to 6x+ exists but depends on continued adoption and execution, so this anchors at 3 rather than a 4.</w:t>
+            </w:r>
+          </w:p>
+        </w:tc>
+      </w:tr>
+      <w:tr>
+        <w:tc>
+          <w:tcPr>
+            <w:tcW w:type="dxa" w:w="2664"/>
+            <w:shd w:val="clear" w:color="auto" w:fill="F5F5F5"/>
+            <w:tcMar>
+              <w:top w:w="40" w:type="dxa"/>
+              <w:bottom w:w="40" w:type="dxa"/>
+              <w:left w:w="60" w:type="dxa"/>
+              <w:right w:w="60" w:type="dxa"/>
+            </w:tcMar>
+            <w:tcBorders>
+              <w:top w:val="nil"/>
+              <w:left w:val="nil"/>
+              <w:right w:val="nil"/>
+              <w:bottom w:val="single" w:sz="4" w:color="E4DFD5"/>
+            </w:tcBorders>
+          </w:tcPr>
+          <w:p>
+            <w:r>
+              <w:rPr>
+                <w:rFonts w:ascii="Sora" w:hAnsi="Sora"/>
+                <w:b w:val="0"/>
+                <w:caps w:val="0"/>
+                <w:color w:val="1A1A1A"/>
+                <w:sz w:val="19"/>
+              </w:rPr>
+              <w:t>AI Score</w:t>
+            </w:r>
+          </w:p>
+        </w:tc>
+        <w:tc>
+          <w:tcPr>
+            <w:tcW w:type="dxa" w:w="792"/>
+            <w:shd w:val="clear" w:color="auto" w:fill="F5F5F5"/>
+            <w:tcMar>
+              <w:top w:w="40" w:type="dxa"/>
+              <w:bottom w:w="40" w:type="dxa"/>
+              <w:left w:w="60" w:type="dxa"/>
+              <w:right w:w="60" w:type="dxa"/>
+            </w:tcMar>
+            <w:tcBorders>
+              <w:top w:val="nil"/>
+              <w:left w:val="nil"/>
+              <w:right w:val="nil"/>
+              <w:bottom w:val="single" w:sz="4" w:color="E4DFD5"/>
+            </w:tcBorders>
+          </w:tcPr>
+          <w:p>
+            <w:r>
+              <w:rPr>
+                <w:rFonts w:ascii="Sora" w:hAnsi="Sora"/>
+                <w:b/>
+                <w:caps w:val="0"/>
+                <w:color w:val="1A1A1A"/>
+                <w:sz w:val="19"/>
+              </w:rPr>
+              <w:t>4</w:t>
+            </w:r>
+            <w:r>
+              <w:rPr>
+                <w:rFonts w:ascii="Sora" w:hAnsi="Sora"/>
+                <w:b w:val="0"/>
+                <w:caps w:val="0"/>
+                <w:color w:val="828282"/>
+                <w:sz w:val="17"/>
+              </w:rPr>
+              <w:t xml:space="preserve"> / 4</w:t>
+            </w:r>
+          </w:p>
+        </w:tc>
+        <w:tc>
+          <w:tcPr>
+            <w:tcW w:type="dxa" w:w="5904"/>
+            <w:shd w:val="clear" w:color="auto" w:fill="F5F5F5"/>
+            <w:tcMar>
+              <w:top w:w="40" w:type="dxa"/>
+              <w:bottom w:w="40" w:type="dxa"/>
+              <w:left w:w="60" w:type="dxa"/>
+              <w:right w:w="60" w:type="dxa"/>
+            </w:tcMar>
+            <w:tcBorders>
+              <w:top w:val="nil"/>
+              <w:left w:val="nil"/>
+              <w:right w:val="nil"/>
+              <w:bottom w:val="single" w:sz="4" w:color="E4DFD5"/>
+            </w:tcBorders>
+          </w:tcPr>
+          <w:p>
+            <w:r>
+              <w:rPr>
+                <w:rFonts w:ascii="Sora" w:hAnsi="Sora"/>
+                <w:b w:val="0"/>
+                <w:caps w:val="0"/>
+                <w:color w:val="3C3C3C"/>
+                <w:sz w:val="18"/>
+              </w:rPr>
+              <w:t>Higharc describes itself as a “homebuilding AI company for the full design-to-construction lifecycle,” using specialized spatial AI models to automate complex workflows across building design, 3D modeling, cost estimating, sales and construction documentation.[4][5][6][8] Its AutoTranslate AI can ingest 2D floor plans, create 3D spatial models and generate precise material takeoffs aligned with supplier catalogs (e.g., US LBM), indicating a proprietary spatial-data representation and domain-specific AI that is core to the moat and not trivially replicable as a generic LLM plugin — this fits the pure-play/structural AI moat anchor.</w:t>
+            </w:r>
+          </w:p>
+        </w:tc>
+      </w:tr>
+      <w:tr>
+        <w:tc>
+          <w:tcPr>
+            <w:tcW w:type="dxa" w:w="2664"/>
+            <w:shd w:val="clear" w:color="auto" w:fill="FFFFFF"/>
+            <w:tcMar>
+              <w:top w:w="40" w:type="dxa"/>
+              <w:bottom w:w="40" w:type="dxa"/>
+              <w:left w:w="60" w:type="dxa"/>
+              <w:right w:w="60" w:type="dxa"/>
+            </w:tcMar>
+            <w:tcBorders>
+              <w:top w:val="nil"/>
+              <w:left w:val="nil"/>
+              <w:right w:val="nil"/>
+              <w:bottom w:val="single" w:sz="4" w:color="E4DFD5"/>
+            </w:tcBorders>
+          </w:tcPr>
+          <w:p>
+            <w:r>
+              <w:rPr>
+                <w:rFonts w:ascii="Sora" w:hAnsi="Sora"/>
+                <w:b w:val="0"/>
+                <w:caps w:val="0"/>
+                <w:color w:val="1A1A1A"/>
+                <w:sz w:val="19"/>
+              </w:rPr>
+              <w:t>Terms</w:t>
+            </w:r>
+          </w:p>
+        </w:tc>
+        <w:tc>
+          <w:tcPr>
+            <w:tcW w:type="dxa" w:w="792"/>
+            <w:shd w:val="clear" w:color="auto" w:fill="FFFFFF"/>
+            <w:tcMar>
+              <w:top w:w="40" w:type="dxa"/>
+              <w:bottom w:w="40" w:type="dxa"/>
+              <w:left w:w="60" w:type="dxa"/>
+              <w:right w:w="60" w:type="dxa"/>
+            </w:tcMar>
+            <w:tcBorders>
+              <w:top w:val="nil"/>
+              <w:left w:val="nil"/>
+              <w:right w:val="nil"/>
+              <w:bottom w:val="single" w:sz="4" w:color="E4DFD5"/>
+            </w:tcBorders>
+          </w:tcPr>
+          <w:p>
+            <w:r>
+              <w:rPr>
+                <w:rFonts w:ascii="Sora" w:hAnsi="Sora"/>
+                <w:b/>
+                <w:caps w:val="0"/>
+                <w:color w:val="1A1A1A"/>
+                <w:sz w:val="19"/>
+              </w:rPr>
+              <w:t>2</w:t>
+            </w:r>
+            <w:r>
+              <w:rPr>
+                <w:rFonts w:ascii="Sora" w:hAnsi="Sora"/>
+                <w:b w:val="0"/>
+                <w:caps w:val="0"/>
+                <w:color w:val="828282"/>
+                <w:sz w:val="17"/>
+              </w:rPr>
+              <w:t xml:space="preserve"> / 4</w:t>
+            </w:r>
+          </w:p>
+        </w:tc>
+        <w:tc>
+          <w:tcPr>
+            <w:tcW w:type="dxa" w:w="5904"/>
+            <w:shd w:val="clear" w:color="auto" w:fill="FFFFFF"/>
+            <w:tcMar>
+              <w:top w:w="40" w:type="dxa"/>
+              <w:bottom w:w="40" w:type="dxa"/>
+              <w:left w:w="60" w:type="dxa"/>
+              <w:right w:w="60" w:type="dxa"/>
+            </w:tcMar>
+            <w:tcBorders>
+              <w:top w:val="nil"/>
+              <w:left w:val="nil"/>
+              <w:right w:val="nil"/>
+              <w:bottom w:val="single" w:sz="4" w:color="E4DFD5"/>
+            </w:tcBorders>
+          </w:tcPr>
+          <w:p>
+            <w:r>
+              <w:rPr>
+                <w:rFonts w:ascii="Sora" w:hAnsi="Sora"/>
+                <w:b w:val="0"/>
+                <w:caps w:val="0"/>
+                <w:color w:val="3C3C3C"/>
+                <w:sz w:val="18"/>
+              </w:rPr>
+              <w:t>Public coverage only discloses that Higharc raised a $95M Series C led by Insight Partners with participation from Wellington, Fifth Wall, Spark, Lux, SE Ventures and others, but does not reveal specific SPV/coinvest economics, carry, upfront fees or information rights for follow-on investors like ID8.[4][5][8] Given terms are [NOT PUBLIC], the score lands at 2 by default (data-missing anchor) rather than assuming standard 0/0/10 or elevated carry, and there is no evidence of disqualifying recurring management fees or extreme carry.</w:t>
+            </w:r>
+          </w:p>
+        </w:tc>
+      </w:tr>
     </w:tbl>
     <w:p>
       <w:pPr>
@@ -222,7 +834,7 @@
           <w:color w:val="1A1A1A"/>
           <w:sz w:val="21"/>
         </w:rPr>
-        <w:t>scoring failed: 401 Client Error: Unauthorized for url: https://api.perplexity.ai/chat/completions</w:t>
+        <w:t>Higharc is a Durham, NC–based homebuilding AI company that just raised a $95M Series C led by Tier 1 investor Insight Partners, clearly within ID8’s North America and Series B+ mandate.[1][4][6] The deal aligns strongly with ID8’s thesis: a new-money Tier 1 lead at Series C, and a product whose moat is genuinely AI-driven via proprietary spatial AI and floor-plan intelligence spanning design, estimating, sales and construction documentation, now extending into the materials supply chain through partners like US LBM.[3][4][5][8] Fundamentals and terms are under-disclosed, so this pass rests on market/qualitative signals and investor quality rather than hard metrics, pulling the overall fit down slightly but without triggering any hard auto-pass conditions.</w:t>
       </w:r>
     </w:p>
     <w:p>
@@ -237,7 +849,7 @@
           <w:color w:val="828282"/>
           <w:sz w:val="18"/>
         </w:rPr>
-        <w:t>Confidence: low</w:t>
+        <w:t>Confidence: medium</w:t>
       </w:r>
     </w:p>
     <w:sectPr>

</xml_diff>